<commit_message>
Copied 5 rooms from demo scene
</commit_message>
<xml_diff>
--- a/Vaidoto/Notes.DOCX
+++ b/Vaidoto/Notes.DOCX
@@ -1,6 +1,6 @@
 
 <file path=word/document.xml><?xml version="1.0" encoding="utf-8"?>
-<w:document xmlns:wpc="http://schemas.microsoft.com/office/word/2010/wordprocessingCanvas" xmlns:cx="http://schemas.microsoft.com/office/drawing/2014/chartex" xmlns:cx1="http://schemas.microsoft.com/office/drawing/2015/9/8/chartex" xmlns:cx2="http://schemas.microsoft.com/office/drawing/2015/10/21/chartex" xmlns:cx3="http://schemas.microsoft.com/office/drawing/2016/5/9/chartex" xmlns:cx4="http://schemas.microsoft.com/office/drawing/2016/5/10/chartex" xmlns:cx5="http://schemas.microsoft.com/office/drawing/2016/5/11/chartex" xmlns:cx6="http://schemas.microsoft.com/office/drawing/2016/5/12/chartex" xmlns:cx7="http://schemas.microsoft.com/office/drawing/2016/5/13/chartex" xmlns:cx8="http://schemas.microsoft.com/office/drawing/2016/5/14/chartex" xmlns:mc="http://schemas.openxmlformats.org/markup-compatibility/2006" xmlns:aink="http://schemas.microsoft.com/office/drawing/2016/ink" xmlns:am3d="http://schemas.microsoft.com/office/drawing/2017/model3d" xmlns:o="urn:schemas-microsoft-com:office:office" xmlns:oel="http://schemas.microsoft.com/office/2019/extlst" xmlns:r="http://schemas.openxmlformats.org/officeDocument/2006/relationships" xmlns:m="http://schemas.openxmlformats.org/officeDocument/2006/math" xmlns:v="urn:schemas-microsoft-com:vml" xmlns:wp14="http://schemas.microsoft.com/office/word/2010/wordprocessingDrawing" xmlns:wp="http://schemas.openxmlformats.org/drawingml/2006/wordprocessingDrawing" xmlns:w10="urn:schemas-microsoft-com:office:word" xmlns:w="http://schemas.openxmlformats.org/wordprocessingml/2006/main" xmlns:w14="http://schemas.microsoft.com/office/word/2010/wordml" xmlns:w15="http://schemas.microsoft.com/office/word/2012/wordml" xmlns:w16cex="http://schemas.microsoft.com/office/word/2018/wordml/cex" xmlns:w16cid="http://schemas.microsoft.com/office/word/2016/wordml/cid" xmlns:w16="http://schemas.microsoft.com/office/word/2018/wordml" xmlns:w16du="http://schemas.microsoft.com/office/word/2023/wordml/word16du" xmlns:w16sdtdh="http://schemas.microsoft.com/office/word/2020/wordml/sdtdatahash" xmlns:w16sdtfl="http://schemas.microsoft.com/office/word/2024/wordml/sdtformatlock" xmlns:w16se="http://schemas.microsoft.com/office/word/2015/wordml/symex" xmlns:wpg="http://schemas.microsoft.com/office/word/2010/wordprocessingGroup" xmlns:wpi="http://schemas.microsoft.com/office/word/2010/wordprocessingInk" xmlns:wne="http://schemas.microsoft.com/office/word/2006/wordml" xmlns:wps="http://schemas.microsoft.com/office/word/2010/wordprocessingShape" mc:Ignorable="w14 w15 w16se w16cid w16 w16cex w16sdtdh w16sdtfl w16du wp14">
+<w:document xmlns:wpc="http://schemas.microsoft.com/office/word/2010/wordprocessingCanvas" xmlns:cx="http://schemas.microsoft.com/office/drawing/2014/chartex" xmlns:cx1="http://schemas.microsoft.com/office/drawing/2015/9/8/chartex" xmlns:cx2="http://schemas.microsoft.com/office/drawing/2015/10/21/chartex" xmlns:cx3="http://schemas.microsoft.com/office/drawing/2016/5/9/chartex" xmlns:cx4="http://schemas.microsoft.com/office/drawing/2016/5/10/chartex" xmlns:cx5="http://schemas.microsoft.com/office/drawing/2016/5/11/chartex" xmlns:cx6="http://schemas.microsoft.com/office/drawing/2016/5/12/chartex" xmlns:cx7="http://schemas.microsoft.com/office/drawing/2016/5/13/chartex" xmlns:cx8="http://schemas.microsoft.com/office/drawing/2016/5/14/chartex" xmlns:mc="http://schemas.openxmlformats.org/markup-compatibility/2006" xmlns:aink="http://schemas.microsoft.com/office/drawing/2016/ink" xmlns:am3d="http://schemas.microsoft.com/office/drawing/2017/model3d" xmlns:o="urn:schemas-microsoft-com:office:office" xmlns:r="http://schemas.openxmlformats.org/officeDocument/2006/relationships" xmlns:m="http://schemas.openxmlformats.org/officeDocument/2006/math" xmlns:v="urn:schemas-microsoft-com:vml" xmlns:wp14="http://schemas.microsoft.com/office/word/2010/wordprocessingDrawing" xmlns:wp="http://schemas.openxmlformats.org/drawingml/2006/wordprocessingDrawing" xmlns:w10="urn:schemas-microsoft-com:office:word" xmlns:w="http://schemas.openxmlformats.org/wordprocessingml/2006/main" xmlns:w14="http://schemas.microsoft.com/office/word/2010/wordml" xmlns:w15="http://schemas.microsoft.com/office/word/2012/wordml" xmlns:w16cex="http://schemas.microsoft.com/office/word/2018/wordml/cex" xmlns:w16cid="http://schemas.microsoft.com/office/word/2016/wordml/cid" xmlns:w16="http://schemas.microsoft.com/office/word/2018/wordml" xmlns:w16sdtdh="http://schemas.microsoft.com/office/word/2020/wordml/sdtdatahash" xmlns:w16se="http://schemas.microsoft.com/office/word/2015/wordml/symex" xmlns:wpg="http://schemas.microsoft.com/office/word/2010/wordprocessingGroup" xmlns:wpi="http://schemas.microsoft.com/office/word/2010/wordprocessingInk" xmlns:wne="http://schemas.microsoft.com/office/word/2006/wordml" xmlns:wps="http://schemas.microsoft.com/office/word/2010/wordprocessingShape" mc:Ignorable="w14 w15 w16se w16cid w16 w16cex w16sdtdh wp14">
   <w:body>
     <w:p>
       <w:pPr>
@@ -377,6 +377,130 @@
         <w:t>it is possibly too complicated for my needs. As I will have fixed amount of unchangeable items, which the player either have or not. I decided to try to have a simple script with a list of booleans to track what the player has at the moment.</w:t>
       </w:r>
     </w:p>
+    <w:p/>
+    <w:p>
+      <w:pPr>
+        <w:rPr>
+          <w:lang w:val="en-US"/>
+        </w:rPr>
+      </w:pPr>
+      <w:r>
+        <w:rPr>
+          <w:lang w:val="en-US"/>
+        </w:rPr>
+        <w:t>List of items</w:t>
+      </w:r>
+    </w:p>
+    <w:p>
+      <w:pPr>
+        <w:pStyle w:val="ListParagraph"/>
+        <w:numPr>
+          <w:ilvl w:val="0"/>
+          <w:numId w:val="2"/>
+        </w:numPr>
+        <w:rPr>
+          <w:lang w:val="en-US"/>
+        </w:rPr>
+      </w:pPr>
+      <w:r>
+        <w:rPr>
+          <w:lang w:val="en-US"/>
+        </w:rPr>
+        <w:t>Axe</w:t>
+      </w:r>
+    </w:p>
+    <w:p>
+      <w:pPr>
+        <w:pStyle w:val="ListParagraph"/>
+        <w:numPr>
+          <w:ilvl w:val="0"/>
+          <w:numId w:val="2"/>
+        </w:numPr>
+        <w:rPr>
+          <w:lang w:val="en-US"/>
+        </w:rPr>
+      </w:pPr>
+      <w:r>
+        <w:rPr>
+          <w:lang w:val="en-US"/>
+        </w:rPr>
+        <w:t>Tinder Box</w:t>
+      </w:r>
+    </w:p>
+    <w:p>
+      <w:pPr>
+        <w:pStyle w:val="ListParagraph"/>
+        <w:numPr>
+          <w:ilvl w:val="0"/>
+          <w:numId w:val="2"/>
+        </w:numPr>
+        <w:rPr>
+          <w:lang w:val="en-US"/>
+        </w:rPr>
+      </w:pPr>
+      <w:r>
+        <w:rPr>
+          <w:lang w:val="en-US"/>
+        </w:rPr>
+        <w:t>Shovel</w:t>
+      </w:r>
+    </w:p>
+    <w:p>
+      <w:pPr>
+        <w:pStyle w:val="ListParagraph"/>
+        <w:numPr>
+          <w:ilvl w:val="0"/>
+          <w:numId w:val="2"/>
+        </w:numPr>
+        <w:rPr>
+          <w:lang w:val="en-US"/>
+        </w:rPr>
+      </w:pPr>
+      <w:r>
+        <w:rPr>
+          <w:lang w:val="en-US"/>
+        </w:rPr>
+        <w:t>Rope</w:t>
+      </w:r>
+    </w:p>
+    <w:p>
+      <w:pPr>
+        <w:pStyle w:val="ListParagraph"/>
+        <w:numPr>
+          <w:ilvl w:val="0"/>
+          <w:numId w:val="2"/>
+        </w:numPr>
+        <w:rPr>
+          <w:lang w:val="en-US"/>
+        </w:rPr>
+      </w:pPr>
+      <w:r>
+        <w:rPr>
+          <w:lang w:val="en-US"/>
+        </w:rPr>
+        <w:t>Crowbar</w:t>
+      </w:r>
+    </w:p>
+    <w:p>
+      <w:pPr>
+        <w:rPr>
+          <w:lang w:val="en-US"/>
+        </w:rPr>
+      </w:pPr>
+    </w:p>
+    <w:p>
+      <w:pPr>
+        <w:rPr>
+          <w:lang w:val="en-US"/>
+        </w:rPr>
+      </w:pPr>
+      <w:r>
+        <w:rPr>
+          <w:lang w:val="en-US"/>
+        </w:rPr>
+        <w:t>For faster start of flashing some rooms, I copied them from Synty demo scene. Now will try to edit it for my need.</w:t>
+      </w:r>
+    </w:p>
     <w:p>
       <w:r>
         <w:t>TODO</w:t>
@@ -475,6 +599,7 @@
         </w:numPr>
       </w:pPr>
       <w:r>
+        <w:lastRenderedPageBreak/>
         <w:t>Crystals in the tunnel (elsewhere) for light.</w:t>
       </w:r>
     </w:p>
@@ -489,8 +614,121 @@
 </file>
 
 <file path=word/numbering.xml><?xml version="1.0" encoding="utf-8"?>
-<w:numbering xmlns:wpc="http://schemas.microsoft.com/office/word/2010/wordprocessingCanvas" xmlns:cx="http://schemas.microsoft.com/office/drawing/2014/chartex" xmlns:cx1="http://schemas.microsoft.com/office/drawing/2015/9/8/chartex" xmlns:cx2="http://schemas.microsoft.com/office/drawing/2015/10/21/chartex" xmlns:cx3="http://schemas.microsoft.com/office/drawing/2016/5/9/chartex" xmlns:cx4="http://schemas.microsoft.com/office/drawing/2016/5/10/chartex" xmlns:cx5="http://schemas.microsoft.com/office/drawing/2016/5/11/chartex" xmlns:cx6="http://schemas.microsoft.com/office/drawing/2016/5/12/chartex" xmlns:cx7="http://schemas.microsoft.com/office/drawing/2016/5/13/chartex" xmlns:cx8="http://schemas.microsoft.com/office/drawing/2016/5/14/chartex" xmlns:mc="http://schemas.openxmlformats.org/markup-compatibility/2006" xmlns:aink="http://schemas.microsoft.com/office/drawing/2016/ink" xmlns:am3d="http://schemas.microsoft.com/office/drawing/2017/model3d" xmlns:o="urn:schemas-microsoft-com:office:office" xmlns:oel="http://schemas.microsoft.com/office/2019/extlst" xmlns:r="http://schemas.openxmlformats.org/officeDocument/2006/relationships" xmlns:m="http://schemas.openxmlformats.org/officeDocument/2006/math" xmlns:v="urn:schemas-microsoft-com:vml" xmlns:wp14="http://schemas.microsoft.com/office/word/2010/wordprocessingDrawing" xmlns:wp="http://schemas.openxmlformats.org/drawingml/2006/wordprocessingDrawing" xmlns:w10="urn:schemas-microsoft-com:office:word" xmlns:w="http://schemas.openxmlformats.org/wordprocessingml/2006/main" xmlns:w14="http://schemas.microsoft.com/office/word/2010/wordml" xmlns:w15="http://schemas.microsoft.com/office/word/2012/wordml" xmlns:w16cex="http://schemas.microsoft.com/office/word/2018/wordml/cex" xmlns:w16cid="http://schemas.microsoft.com/office/word/2016/wordml/cid" xmlns:w16="http://schemas.microsoft.com/office/word/2018/wordml" xmlns:w16du="http://schemas.microsoft.com/office/word/2023/wordml/word16du" xmlns:w16sdtdh="http://schemas.microsoft.com/office/word/2020/wordml/sdtdatahash" xmlns:w16sdtfl="http://schemas.microsoft.com/office/word/2024/wordml/sdtformatlock" xmlns:w16se="http://schemas.microsoft.com/office/word/2015/wordml/symex" xmlns:wpg="http://schemas.microsoft.com/office/word/2010/wordprocessingGroup" xmlns:wpi="http://schemas.microsoft.com/office/word/2010/wordprocessingInk" xmlns:wne="http://schemas.microsoft.com/office/word/2006/wordml" xmlns:wps="http://schemas.microsoft.com/office/word/2010/wordprocessingShape" mc:Ignorable="w14 w15 w16se w16cid w16 w16cex w16sdtdh w16sdtfl w16du wp14">
+<w:numbering xmlns:wpc="http://schemas.microsoft.com/office/word/2010/wordprocessingCanvas" xmlns:cx="http://schemas.microsoft.com/office/drawing/2014/chartex" xmlns:cx1="http://schemas.microsoft.com/office/drawing/2015/9/8/chartex" xmlns:cx2="http://schemas.microsoft.com/office/drawing/2015/10/21/chartex" xmlns:cx3="http://schemas.microsoft.com/office/drawing/2016/5/9/chartex" xmlns:cx4="http://schemas.microsoft.com/office/drawing/2016/5/10/chartex" xmlns:cx5="http://schemas.microsoft.com/office/drawing/2016/5/11/chartex" xmlns:cx6="http://schemas.microsoft.com/office/drawing/2016/5/12/chartex" xmlns:cx7="http://schemas.microsoft.com/office/drawing/2016/5/13/chartex" xmlns:cx8="http://schemas.microsoft.com/office/drawing/2016/5/14/chartex" xmlns:mc="http://schemas.openxmlformats.org/markup-compatibility/2006" xmlns:aink="http://schemas.microsoft.com/office/drawing/2016/ink" xmlns:am3d="http://schemas.microsoft.com/office/drawing/2017/model3d" xmlns:o="urn:schemas-microsoft-com:office:office" xmlns:r="http://schemas.openxmlformats.org/officeDocument/2006/relationships" xmlns:m="http://schemas.openxmlformats.org/officeDocument/2006/math" xmlns:v="urn:schemas-microsoft-com:vml" xmlns:wp14="http://schemas.microsoft.com/office/word/2010/wordprocessingDrawing" xmlns:wp="http://schemas.openxmlformats.org/drawingml/2006/wordprocessingDrawing" xmlns:w10="urn:schemas-microsoft-com:office:word" xmlns:w="http://schemas.openxmlformats.org/wordprocessingml/2006/main" xmlns:w14="http://schemas.microsoft.com/office/word/2010/wordml" xmlns:w15="http://schemas.microsoft.com/office/word/2012/wordml" xmlns:w16cex="http://schemas.microsoft.com/office/word/2018/wordml/cex" xmlns:w16cid="http://schemas.microsoft.com/office/word/2016/wordml/cid" xmlns:w16="http://schemas.microsoft.com/office/word/2018/wordml" xmlns:w16sdtdh="http://schemas.microsoft.com/office/word/2020/wordml/sdtdatahash" xmlns:w16se="http://schemas.microsoft.com/office/word/2015/wordml/symex" xmlns:wpg="http://schemas.microsoft.com/office/word/2010/wordprocessingGroup" xmlns:wpi="http://schemas.microsoft.com/office/word/2010/wordprocessingInk" xmlns:wne="http://schemas.microsoft.com/office/word/2006/wordml" xmlns:wps="http://schemas.microsoft.com/office/word/2010/wordprocessingShape" mc:Ignorable="w14 w15 w16se w16cid w16 w16cex w16sdtdh wp14">
   <w:abstractNum w:abstractNumId="0" w15:restartNumberingAfterBreak="0">
+    <w:nsid w:val="0E8C3620"/>
+    <w:multiLevelType w:val="hybridMultilevel"/>
+    <w:tmpl w:val="767AC08C"/>
+    <w:lvl w:ilvl="0" w:tplc="04140001">
+      <w:start w:val="1"/>
+      <w:numFmt w:val="bullet"/>
+      <w:lvlText w:val=""/>
+      <w:lvlJc w:val="left"/>
+      <w:pPr>
+        <w:ind w:left="720" w:hanging="360"/>
+      </w:pPr>
+      <w:rPr>
+        <w:rFonts w:ascii="Symbol" w:hAnsi="Symbol" w:hint="default"/>
+      </w:rPr>
+    </w:lvl>
+    <w:lvl w:ilvl="1" w:tplc="04140003" w:tentative="1">
+      <w:start w:val="1"/>
+      <w:numFmt w:val="bullet"/>
+      <w:lvlText w:val="o"/>
+      <w:lvlJc w:val="left"/>
+      <w:pPr>
+        <w:ind w:left="1440" w:hanging="360"/>
+      </w:pPr>
+      <w:rPr>
+        <w:rFonts w:ascii="Courier New" w:hAnsi="Courier New" w:cs="Courier New" w:hint="default"/>
+      </w:rPr>
+    </w:lvl>
+    <w:lvl w:ilvl="2" w:tplc="04140005" w:tentative="1">
+      <w:start w:val="1"/>
+      <w:numFmt w:val="bullet"/>
+      <w:lvlText w:val=""/>
+      <w:lvlJc w:val="left"/>
+      <w:pPr>
+        <w:ind w:left="2160" w:hanging="360"/>
+      </w:pPr>
+      <w:rPr>
+        <w:rFonts w:ascii="Wingdings" w:hAnsi="Wingdings" w:hint="default"/>
+      </w:rPr>
+    </w:lvl>
+    <w:lvl w:ilvl="3" w:tplc="04140001" w:tentative="1">
+      <w:start w:val="1"/>
+      <w:numFmt w:val="bullet"/>
+      <w:lvlText w:val=""/>
+      <w:lvlJc w:val="left"/>
+      <w:pPr>
+        <w:ind w:left="2880" w:hanging="360"/>
+      </w:pPr>
+      <w:rPr>
+        <w:rFonts w:ascii="Symbol" w:hAnsi="Symbol" w:hint="default"/>
+      </w:rPr>
+    </w:lvl>
+    <w:lvl w:ilvl="4" w:tplc="04140003" w:tentative="1">
+      <w:start w:val="1"/>
+      <w:numFmt w:val="bullet"/>
+      <w:lvlText w:val="o"/>
+      <w:lvlJc w:val="left"/>
+      <w:pPr>
+        <w:ind w:left="3600" w:hanging="360"/>
+      </w:pPr>
+      <w:rPr>
+        <w:rFonts w:ascii="Courier New" w:hAnsi="Courier New" w:cs="Courier New" w:hint="default"/>
+      </w:rPr>
+    </w:lvl>
+    <w:lvl w:ilvl="5" w:tplc="04140005" w:tentative="1">
+      <w:start w:val="1"/>
+      <w:numFmt w:val="bullet"/>
+      <w:lvlText w:val=""/>
+      <w:lvlJc w:val="left"/>
+      <w:pPr>
+        <w:ind w:left="4320" w:hanging="360"/>
+      </w:pPr>
+      <w:rPr>
+        <w:rFonts w:ascii="Wingdings" w:hAnsi="Wingdings" w:hint="default"/>
+      </w:rPr>
+    </w:lvl>
+    <w:lvl w:ilvl="6" w:tplc="04140001" w:tentative="1">
+      <w:start w:val="1"/>
+      <w:numFmt w:val="bullet"/>
+      <w:lvlText w:val=""/>
+      <w:lvlJc w:val="left"/>
+      <w:pPr>
+        <w:ind w:left="5040" w:hanging="360"/>
+      </w:pPr>
+      <w:rPr>
+        <w:rFonts w:ascii="Symbol" w:hAnsi="Symbol" w:hint="default"/>
+      </w:rPr>
+    </w:lvl>
+    <w:lvl w:ilvl="7" w:tplc="04140003" w:tentative="1">
+      <w:start w:val="1"/>
+      <w:numFmt w:val="bullet"/>
+      <w:lvlText w:val="o"/>
+      <w:lvlJc w:val="left"/>
+      <w:pPr>
+        <w:ind w:left="5760" w:hanging="360"/>
+      </w:pPr>
+      <w:rPr>
+        <w:rFonts w:ascii="Courier New" w:hAnsi="Courier New" w:cs="Courier New" w:hint="default"/>
+      </w:rPr>
+    </w:lvl>
+    <w:lvl w:ilvl="8" w:tplc="04140005" w:tentative="1">
+      <w:start w:val="1"/>
+      <w:numFmt w:val="bullet"/>
+      <w:lvlText w:val=""/>
+      <w:lvlJc w:val="left"/>
+      <w:pPr>
+        <w:ind w:left="6480" w:hanging="360"/>
+      </w:pPr>
+      <w:rPr>
+        <w:rFonts w:ascii="Wingdings" w:hAnsi="Wingdings" w:hint="default"/>
+      </w:rPr>
+    </w:lvl>
+  </w:abstractNum>
+  <w:abstractNum w:abstractNumId="1" w15:restartNumberingAfterBreak="0">
     <w:nsid w:val="4C180834"/>
     <w:multiLevelType w:val="hybridMultilevel"/>
     <w:tmpl w:val="A2CC1F18"/>
@@ -603,14 +841,17 @@
       </w:rPr>
     </w:lvl>
   </w:abstractNum>
-  <w:num w:numId="1" w16cid:durableId="78524517">
+  <w:num w:numId="1">
+    <w:abstractNumId w:val="1"/>
+  </w:num>
+  <w:num w:numId="2">
     <w:abstractNumId w:val="0"/>
   </w:num>
 </w:numbering>
 </file>
 
 <file path=word/styles.xml><?xml version="1.0" encoding="utf-8"?>
-<w:styles xmlns:mc="http://schemas.openxmlformats.org/markup-compatibility/2006" xmlns:r="http://schemas.openxmlformats.org/officeDocument/2006/relationships" xmlns:w="http://schemas.openxmlformats.org/wordprocessingml/2006/main" xmlns:w14="http://schemas.microsoft.com/office/word/2010/wordml" xmlns:w15="http://schemas.microsoft.com/office/word/2012/wordml" xmlns:w16cex="http://schemas.microsoft.com/office/word/2018/wordml/cex" xmlns:w16cid="http://schemas.microsoft.com/office/word/2016/wordml/cid" xmlns:w16="http://schemas.microsoft.com/office/word/2018/wordml" xmlns:w16du="http://schemas.microsoft.com/office/word/2023/wordml/word16du" xmlns:w16sdtdh="http://schemas.microsoft.com/office/word/2020/wordml/sdtdatahash" xmlns:w16sdtfl="http://schemas.microsoft.com/office/word/2024/wordml/sdtformatlock" xmlns:w16se="http://schemas.microsoft.com/office/word/2015/wordml/symex" mc:Ignorable="w14 w15 w16se w16cid w16 w16cex w16sdtdh w16sdtfl w16du">
+<w:styles xmlns:mc="http://schemas.openxmlformats.org/markup-compatibility/2006" xmlns:r="http://schemas.openxmlformats.org/officeDocument/2006/relationships" xmlns:w="http://schemas.openxmlformats.org/wordprocessingml/2006/main" xmlns:w14="http://schemas.microsoft.com/office/word/2010/wordml" xmlns:w15="http://schemas.microsoft.com/office/word/2012/wordml" xmlns:w16cex="http://schemas.microsoft.com/office/word/2018/wordml/cex" xmlns:w16cid="http://schemas.microsoft.com/office/word/2016/wordml/cid" xmlns:w16="http://schemas.microsoft.com/office/word/2018/wordml" xmlns:w16sdtdh="http://schemas.microsoft.com/office/word/2020/wordml/sdtdatahash" xmlns:w16se="http://schemas.microsoft.com/office/word/2015/wordml/symex" mc:Ignorable="w14 w15 w16se w16cid w16 w16cex w16sdtdh">
   <w:docDefaults>
     <w:rPrDefault>
       <w:rPr>
@@ -1211,6 +1452,7 @@
   <w:style w:type="character" w:default="1" w:styleId="DefaultParagraphFont">
     <w:name w:val="Default Paragraph Font"/>
     <w:uiPriority w:val="1"/>
+    <w:semiHidden/>
     <w:unhideWhenUsed/>
   </w:style>
   <w:style w:type="table" w:default="1" w:styleId="TableNormal">

</xml_diff>

<commit_message>
Item highlight Done and start of portals
</commit_message>
<xml_diff>
--- a/Vaidoto/Notes.DOCX
+++ b/Vaidoto/Notes.DOCX
@@ -507,11 +507,256 @@
           <w:lang w:val="en-US"/>
         </w:rPr>
       </w:pPr>
+    </w:p>
+    <w:p>
+      <w:pPr>
+        <w:rPr>
+          <w:lang w:val="en-US"/>
+        </w:rPr>
+      </w:pPr>
       <w:r>
         <w:rPr>
           <w:lang w:val="en-US"/>
         </w:rPr>
         <w:t>I need some targeting system. So a player could hover over items to pick it up or interact.</w:t>
+      </w:r>
+      <w:r>
+        <w:rPr>
+          <w:lang w:val="en-US"/>
+        </w:rPr>
+        <w:t xml:space="preserve"> I decided to try </w:t>
+      </w:r>
+      <w:r>
+        <w:rPr>
+          <w:b/>
+          <w:bCs/>
+          <w:lang w:val="en-US"/>
+        </w:rPr>
+        <w:t>Object Insights Highlighter</w:t>
+      </w:r>
+      <w:r>
+        <w:rPr>
+          <w:b/>
+          <w:bCs/>
+          <w:lang w:val="en-US"/>
+        </w:rPr>
+        <w:t xml:space="preserve"> </w:t>
+      </w:r>
+      <w:r>
+        <w:rPr>
+          <w:lang w:val="en-US"/>
+        </w:rPr>
+        <w:t>from Unity Assets store which I wanted to try for very long time.</w:t>
+      </w:r>
+    </w:p>
+    <w:p>
+      <w:pPr>
+        <w:rPr>
+          <w:lang w:val="en-US"/>
+        </w:rPr>
+      </w:pPr>
+      <w:r>
+        <w:rPr>
+          <w:lang w:val="en-US"/>
+        </w:rPr>
+        <w:lastRenderedPageBreak/>
+        <w:t>Looks like it doesn’t work just “straight out of the box”, need to find if I missed any scripts.</w:t>
+      </w:r>
+      <w:r>
+        <w:rPr>
+          <w:noProof/>
+          <w:lang w:val="en-US"/>
+        </w:rPr>
+        <w:drawing>
+          <wp:inline distT="0" distB="0" distL="0" distR="0" wp14:anchorId="19EB5904" wp14:editId="00D26848">
+            <wp:extent cx="5762625" cy="2628900"/>
+            <wp:effectExtent l="0" t="0" r="9525" b="0"/>
+            <wp:docPr id="1" name="Picture 1"/>
+            <wp:cNvGraphicFramePr>
+              <a:graphicFrameLocks xmlns:a="http://schemas.openxmlformats.org/drawingml/2006/main" noChangeAspect="1"/>
+            </wp:cNvGraphicFramePr>
+            <a:graphic xmlns:a="http://schemas.openxmlformats.org/drawingml/2006/main">
+              <a:graphicData uri="http://schemas.openxmlformats.org/drawingml/2006/picture">
+                <pic:pic xmlns:pic="http://schemas.openxmlformats.org/drawingml/2006/picture">
+                  <pic:nvPicPr>
+                    <pic:cNvPr id="0" name="Picture 1"/>
+                    <pic:cNvPicPr>
+                      <a:picLocks noChangeAspect="1" noChangeArrowheads="1"/>
+                    </pic:cNvPicPr>
+                  </pic:nvPicPr>
+                  <pic:blipFill>
+                    <a:blip r:embed="rId11">
+                      <a:extLst>
+                        <a:ext uri="{28A0092B-C50C-407E-A947-70E740481C1C}">
+                          <a14:useLocalDpi xmlns:a14="http://schemas.microsoft.com/office/drawing/2010/main" val="0"/>
+                        </a:ext>
+                      </a:extLst>
+                    </a:blip>
+                    <a:srcRect/>
+                    <a:stretch>
+                      <a:fillRect/>
+                    </a:stretch>
+                  </pic:blipFill>
+                  <pic:spPr bwMode="auto">
+                    <a:xfrm>
+                      <a:off x="0" y="0"/>
+                      <a:ext cx="5762625" cy="2628900"/>
+                    </a:xfrm>
+                    <a:prstGeom prst="rect">
+                      <a:avLst/>
+                    </a:prstGeom>
+                    <a:noFill/>
+                    <a:ln>
+                      <a:noFill/>
+                    </a:ln>
+                  </pic:spPr>
+                </pic:pic>
+              </a:graphicData>
+            </a:graphic>
+          </wp:inline>
+        </w:drawing>
+      </w:r>
+    </w:p>
+    <w:p>
+      <w:pPr>
+        <w:rPr>
+          <w:lang w:val="en-US"/>
+        </w:rPr>
+      </w:pPr>
+      <w:r>
+        <w:rPr>
+          <w:lang w:val="en-US"/>
+        </w:rPr>
+        <w:t>Yes, there was a script with raycast for camera. It still doesn’t work for interactive object detail popup.</w:t>
+      </w:r>
+      <w:r>
+        <w:rPr>
+          <w:lang w:val="en-US"/>
+        </w:rPr>
+        <w:t xml:space="preserve"> I missed to assign a button from drop down menu. Now everything works. And hopefully I have working raycast for other kind of interactions.</w:t>
+      </w:r>
+      <w:r>
+        <w:rPr>
+          <w:lang w:val="en-US"/>
+        </w:rPr>
+        <w:br/>
+      </w:r>
+      <w:r>
+        <w:rPr>
+          <w:noProof/>
+          <w:lang w:val="en-US"/>
+        </w:rPr>
+        <w:drawing>
+          <wp:inline distT="0" distB="0" distL="0" distR="0" wp14:anchorId="31068743" wp14:editId="526AF101">
+            <wp:extent cx="5743575" cy="2114550"/>
+            <wp:effectExtent l="0" t="0" r="9525" b="0"/>
+            <wp:docPr id="2" name="Picture 2"/>
+            <wp:cNvGraphicFramePr>
+              <a:graphicFrameLocks xmlns:a="http://schemas.openxmlformats.org/drawingml/2006/main" noChangeAspect="1"/>
+            </wp:cNvGraphicFramePr>
+            <a:graphic xmlns:a="http://schemas.openxmlformats.org/drawingml/2006/main">
+              <a:graphicData uri="http://schemas.openxmlformats.org/drawingml/2006/picture">
+                <pic:pic xmlns:pic="http://schemas.openxmlformats.org/drawingml/2006/picture">
+                  <pic:nvPicPr>
+                    <pic:cNvPr id="0" name="Picture 2"/>
+                    <pic:cNvPicPr>
+                      <a:picLocks noChangeAspect="1" noChangeArrowheads="1"/>
+                    </pic:cNvPicPr>
+                  </pic:nvPicPr>
+                  <pic:blipFill>
+                    <a:blip r:embed="rId12">
+                      <a:extLst>
+                        <a:ext uri="{28A0092B-C50C-407E-A947-70E740481C1C}">
+                          <a14:useLocalDpi xmlns:a14="http://schemas.microsoft.com/office/drawing/2010/main" val="0"/>
+                        </a:ext>
+                      </a:extLst>
+                    </a:blip>
+                    <a:srcRect/>
+                    <a:stretch>
+                      <a:fillRect/>
+                    </a:stretch>
+                  </pic:blipFill>
+                  <pic:spPr bwMode="auto">
+                    <a:xfrm>
+                      <a:off x="0" y="0"/>
+                      <a:ext cx="5743575" cy="2114550"/>
+                    </a:xfrm>
+                    <a:prstGeom prst="rect">
+                      <a:avLst/>
+                    </a:prstGeom>
+                    <a:noFill/>
+                    <a:ln>
+                      <a:noFill/>
+                    </a:ln>
+                  </pic:spPr>
+                </pic:pic>
+              </a:graphicData>
+            </a:graphic>
+          </wp:inline>
+        </w:drawing>
+      </w:r>
+    </w:p>
+    <w:p>
+      <w:pPr>
+        <w:rPr>
+          <w:lang w:val="en-US"/>
+        </w:rPr>
+      </w:pPr>
+    </w:p>
+    <w:p>
+      <w:pPr>
+        <w:rPr>
+          <w:lang w:val="en-US"/>
+        </w:rPr>
+      </w:pPr>
+      <w:r>
+        <w:rPr>
+          <w:lang w:val="en-US"/>
+        </w:rPr>
+        <w:t>I need some teleportation system, preferably with choice of swapping destinations.</w:t>
+      </w:r>
+      <w:r>
+        <w:rPr>
+          <w:lang w:val="en-US"/>
+        </w:rPr>
+        <w:t xml:space="preserve"> After long search I found a tutorial </w:t>
+      </w:r>
+      <w:r>
+        <w:rPr>
+          <w:b/>
+          <w:bCs/>
+          <w:lang w:val="en-US"/>
+        </w:rPr>
+        <w:t>Creating a Portal System in Unity</w:t>
+      </w:r>
+      <w:r>
+        <w:rPr>
+          <w:b/>
+          <w:bCs/>
+          <w:lang w:val="en-US"/>
+        </w:rPr>
+        <w:t xml:space="preserve"> </w:t>
+      </w:r>
+      <w:r>
+        <w:rPr>
+          <w:lang w:val="en-US"/>
+        </w:rPr>
+        <w:t>(</w:t>
+      </w:r>
+      <w:hyperlink r:id="rId13" w:history="1">
+        <w:r>
+          <w:rPr>
+            <w:rStyle w:val="Hyperlink"/>
+            <w:lang w:val="en-US"/>
+          </w:rPr>
+          <w:t>https://medium.com/@tmaurodot/creating-a-portal-system-in-unity-f25954537c00</w:t>
+        </w:r>
+      </w:hyperlink>
+      <w:r>
+        <w:rPr>
+          <w:lang w:val="en-US"/>
+        </w:rPr>
+        <w:t>). It is not ideal as the portal looks like an unmoving image. But will sort it out later if I have time.</w:t>
       </w:r>
     </w:p>
     <w:p>
@@ -588,7 +833,6 @@
         </w:numPr>
       </w:pPr>
       <w:r>
-        <w:lastRenderedPageBreak/>
         <w:t>Slots for runes</w:t>
       </w:r>
     </w:p>
@@ -601,6 +845,7 @@
         </w:numPr>
       </w:pPr>
       <w:r>
+        <w:lastRenderedPageBreak/>
         <w:t>Inventory system (some kind)</w:t>
       </w:r>
     </w:p>
@@ -1465,7 +1710,6 @@
   <w:style w:type="character" w:default="1" w:styleId="DefaultParagraphFont">
     <w:name w:val="Default Paragraph Font"/>
     <w:uiPriority w:val="1"/>
-    <w:semiHidden/>
     <w:unhideWhenUsed/>
   </w:style>
   <w:style w:type="table" w:default="1" w:styleId="TableNormal">

</xml_diff>

<commit_message>
Statue hands have only 1 rune
</commit_message>
<xml_diff>
--- a/Vaidoto/Notes.DOCX
+++ b/Vaidoto/Notes.DOCX
@@ -498,7 +498,21 @@
         <w:rPr>
           <w:lang w:val="en-US"/>
         </w:rPr>
-        <w:t>For faster start of flashing some rooms, I copied them from Synty demo scene. Now will try to edit it for my need.</w:t>
+        <w:t xml:space="preserve">For faster start of flashing some rooms, I copied them from </w:t>
+      </w:r>
+      <w:proofErr w:type="spellStart"/>
+      <w:r>
+        <w:rPr>
+          <w:lang w:val="en-US"/>
+        </w:rPr>
+        <w:t>Synty</w:t>
+      </w:r>
+      <w:proofErr w:type="spellEnd"/>
+      <w:r>
+        <w:rPr>
+          <w:lang w:val="en-US"/>
+        </w:rPr>
+        <w:t xml:space="preserve"> demo scene. Now will try to edit it for my need.</w:t>
       </w:r>
     </w:p>
     <w:p>
@@ -760,6 +774,139 @@
       </w:r>
     </w:p>
     <w:p>
+      <w:pPr>
+        <w:rPr>
+          <w:lang w:val="en-US"/>
+        </w:rPr>
+      </w:pPr>
+      <w:r>
+        <w:rPr>
+          <w:lang w:val="en-US"/>
+        </w:rPr>
+        <w:t>Tutorials to look at if I have time:</w:t>
+      </w:r>
+      <w:r>
+        <w:rPr>
+          <w:lang w:val="en-US"/>
+        </w:rPr>
+        <w:br/>
+      </w:r>
+      <w:hyperlink r:id="rId14" w:history="1">
+        <w:r>
+          <w:rPr>
+            <w:rStyle w:val="Hyperlink"/>
+            <w:lang w:val="en-US"/>
+          </w:rPr>
+          <w:t>https://www.youtube.com/watch?v=cWpFZbjtSQg</w:t>
+        </w:r>
+      </w:hyperlink>
+    </w:p>
+    <w:p>
+      <w:pPr>
+        <w:rPr>
+          <w:lang w:val="en-US"/>
+        </w:rPr>
+      </w:pPr>
+    </w:p>
+    <w:p>
+      <w:pPr>
+        <w:rPr>
+          <w:lang w:val="en-US"/>
+        </w:rPr>
+      </w:pPr>
+      <w:r>
+        <w:rPr>
+          <w:lang w:val="en-US"/>
+        </w:rPr>
+        <w:t>I need to make rune slots interactable for player to be able to insert the runes.</w:t>
+      </w:r>
+    </w:p>
+    <w:p>
+      <w:pPr>
+        <w:rPr>
+          <w:noProof/>
+        </w:rPr>
+      </w:pPr>
+      <w:r>
+        <w:rPr>
+          <w:lang w:val="en-US"/>
+        </w:rPr>
+        <w:lastRenderedPageBreak/>
+        <w:t>Managed to turn off rune object adding few lines to Object Insights scripts. Now need to mark it in players Inventory</w:t>
+      </w:r>
+      <w:r>
+        <w:rPr>
+          <w:lang w:val="en-US"/>
+        </w:rPr>
+        <w:t xml:space="preserve"> and display in player’s HUD</w:t>
+      </w:r>
+      <w:r>
+        <w:rPr>
+          <w:lang w:val="en-US"/>
+        </w:rPr>
+        <w:t>.</w:t>
+      </w:r>
+      <w:r>
+        <w:rPr>
+          <w:lang w:val="en-US"/>
+        </w:rPr>
+        <w:br/>
+      </w:r>
+      <w:r>
+        <w:rPr>
+          <w:noProof/>
+        </w:rPr>
+        <w:t xml:space="preserve"> </w:t>
+      </w:r>
+      <w:r>
+        <w:rPr>
+          <w:lang w:val="en-US"/>
+        </w:rPr>
+        <w:drawing>
+          <wp:inline distT="0" distB="0" distL="0" distR="0" wp14:anchorId="6EE735D7" wp14:editId="37096155">
+            <wp:extent cx="3305636" cy="981212"/>
+            <wp:effectExtent l="0" t="0" r="0" b="9525"/>
+            <wp:docPr id="3" name="Picture 3"/>
+            <wp:cNvGraphicFramePr>
+              <a:graphicFrameLocks xmlns:a="http://schemas.openxmlformats.org/drawingml/2006/main" noChangeAspect="1"/>
+            </wp:cNvGraphicFramePr>
+            <a:graphic xmlns:a="http://schemas.openxmlformats.org/drawingml/2006/main">
+              <a:graphicData uri="http://schemas.openxmlformats.org/drawingml/2006/picture">
+                <pic:pic xmlns:pic="http://schemas.openxmlformats.org/drawingml/2006/picture">
+                  <pic:nvPicPr>
+                    <pic:cNvPr id="1" name=""/>
+                    <pic:cNvPicPr/>
+                  </pic:nvPicPr>
+                  <pic:blipFill>
+                    <a:blip r:embed="rId15"/>
+                    <a:stretch>
+                      <a:fillRect/>
+                    </a:stretch>
+                  </pic:blipFill>
+                  <pic:spPr>
+                    <a:xfrm>
+                      <a:off x="0" y="0"/>
+                      <a:ext cx="3305636" cy="981212"/>
+                    </a:xfrm>
+                    <a:prstGeom prst="rect">
+                      <a:avLst/>
+                    </a:prstGeom>
+                  </pic:spPr>
+                </pic:pic>
+              </a:graphicData>
+            </a:graphic>
+          </wp:inline>
+        </w:drawing>
+      </w:r>
+    </w:p>
+    <w:p>
+      <w:pPr>
+        <w:rPr>
+          <w:lang w:val="en-US"/>
+        </w:rPr>
+      </w:pPr>
+    </w:p>
+    <w:p>
       <w:r>
         <w:t>TODO</w:t>
       </w:r>
@@ -845,8 +992,7 @@
         </w:numPr>
       </w:pPr>
       <w:r>
-        <w:lastRenderedPageBreak/>
-        <w:t>Inventory system (some kind)</w:t>
+        <w:t>Crystals in the tunnel (elsewhere) for light.</w:t>
       </w:r>
     </w:p>
     <w:p>
@@ -858,7 +1004,7 @@
         </w:numPr>
       </w:pPr>
       <w:r>
-        <w:t>Crystals in the tunnel (elsewhere) for light.</w:t>
+        <w:t>+ Inventory system (some kind)</w:t>
       </w:r>
     </w:p>
     <w:sectPr>
@@ -1710,6 +1856,7 @@
   <w:style w:type="character" w:default="1" w:styleId="DefaultParagraphFont">
     <w:name w:val="Default Paragraph Font"/>
     <w:uiPriority w:val="1"/>
+    <w:semiHidden/>
     <w:unhideWhenUsed/>
   </w:style>
   <w:style w:type="table" w:default="1" w:styleId="TableNormal">

</xml_diff>

<commit_message>
Added ambient and teleportation sound to all portals
</commit_message>
<xml_diff>
--- a/Vaidoto/Notes.DOCX
+++ b/Vaidoto/Notes.DOCX
@@ -5,27 +5,13 @@
     <w:p>
       <w:pPr>
         <w:pStyle w:val="Heading2"/>
-        <w:rPr>
-          <w:lang w:val="en-US"/>
-        </w:rPr>
-      </w:pPr>
-      <w:r>
-        <w:rPr>
-          <w:lang w:val="en-US"/>
-        </w:rPr>
+      </w:pPr>
+      <w:r>
         <w:t>Making Character Controller</w:t>
       </w:r>
     </w:p>
     <w:p>
-      <w:pPr>
-        <w:rPr>
-          <w:lang w:val="en-US"/>
-        </w:rPr>
-      </w:pPr>
-      <w:r>
-        <w:rPr>
-          <w:lang w:val="en-US"/>
-        </w:rPr>
+      <w:r>
         <w:t xml:space="preserve">First I tried to copy controller solution from </w:t>
       </w:r>
     </w:p>
@@ -62,11 +48,8 @@
     </w:p>
     <w:p>
       <w:r>
-        <w:rPr>
-          <w:noProof/>
-        </w:rPr>
         <w:drawing>
-          <wp:inline distT="0" distB="0" distL="0" distR="0" wp14:anchorId="2AF914CF" wp14:editId="6BD897E9">
+          <wp:inline distT="0" distB="0" distL="0" distR="0" wp14:anchorId="2AF914CF" wp14:editId="71390B02">
             <wp:extent cx="5753100" cy="4229100"/>
             <wp:effectExtent l="0" t="0" r="0" b="0"/>
             <wp:docPr id="1038826422" name="Picture 2"/>
@@ -123,9 +106,6 @@
     </w:p>
     <w:p>
       <w:r>
-        <w:rPr>
-          <w:noProof/>
-        </w:rPr>
         <w:drawing>
           <wp:inline distT="0" distB="0" distL="0" distR="0" wp14:anchorId="2C10F1A4" wp14:editId="54C6B286">
             <wp:extent cx="5753735" cy="422910"/>
@@ -208,9 +188,6 @@
     </w:p>
     <w:p>
       <w:r>
-        <w:rPr>
-          <w:noProof/>
-        </w:rPr>
         <w:drawing>
           <wp:inline distT="0" distB="0" distL="0" distR="0" wp14:anchorId="3E02D91D" wp14:editId="55720985">
             <wp:extent cx="5753735" cy="5400040"/>
@@ -277,9 +254,6 @@
     </w:p>
     <w:p>
       <w:r>
-        <w:rPr>
-          <w:noProof/>
-        </w:rPr>
         <w:drawing>
           <wp:inline distT="0" distB="0" distL="0" distR="0" wp14:anchorId="67EDECC9" wp14:editId="4F96C462">
             <wp:extent cx="5753735" cy="2105025"/>
@@ -344,14 +318,7 @@
           <w:b/>
           <w:bCs/>
         </w:rPr>
-        <w:t>How to make an inventory system in Unity</w:t>
-      </w:r>
-      <w:r>
-        <w:rPr>
-          <w:b/>
-          <w:bCs/>
-        </w:rPr>
-        <w:t xml:space="preserve"> (</w:t>
+        <w:t>How to make an inventory system in Unity (</w:t>
       </w:r>
       <w:hyperlink r:id="rId10" w:history="1">
         <w:r>
@@ -371,23 +338,12 @@
         <w:t>)</w:t>
       </w:r>
       <w:r>
-        <w:t xml:space="preserve">, but soon realised that </w:t>
-      </w:r>
-      <w:r>
-        <w:t>it is possibly too complicated for my needs. As I will have fixed amount of unchangeable items, which the player either have or not. I decided to try to have a simple script with a list of booleans to track what the player has at the moment.</w:t>
+        <w:t>, but soon realised that it is possibly too complicated for my needs. As I will have fixed amount of unchangeable items, which the player either have or not. I decided to try to have a simple script with a list of booleans to track what the player has at the moment.</w:t>
       </w:r>
     </w:p>
     <w:p/>
     <w:p>
-      <w:pPr>
-        <w:rPr>
-          <w:lang w:val="en-US"/>
-        </w:rPr>
-      </w:pPr>
-      <w:r>
-        <w:rPr>
-          <w:lang w:val="en-US"/>
-        </w:rPr>
+      <w:r>
         <w:t>List of items</w:t>
       </w:r>
     </w:p>
@@ -398,14 +354,8 @@
           <w:ilvl w:val="0"/>
           <w:numId w:val="2"/>
         </w:numPr>
-        <w:rPr>
-          <w:lang w:val="en-US"/>
-        </w:rPr>
-      </w:pPr>
-      <w:r>
-        <w:rPr>
-          <w:lang w:val="en-US"/>
-        </w:rPr>
+      </w:pPr>
+      <w:r>
         <w:t>Axe</w:t>
       </w:r>
     </w:p>
@@ -416,14 +366,8 @@
           <w:ilvl w:val="0"/>
           <w:numId w:val="2"/>
         </w:numPr>
-        <w:rPr>
-          <w:lang w:val="en-US"/>
-        </w:rPr>
-      </w:pPr>
-      <w:r>
-        <w:rPr>
-          <w:lang w:val="en-US"/>
-        </w:rPr>
+      </w:pPr>
+      <w:r>
         <w:t>Tinder Box</w:t>
       </w:r>
     </w:p>
@@ -434,14 +378,8 @@
           <w:ilvl w:val="0"/>
           <w:numId w:val="2"/>
         </w:numPr>
-        <w:rPr>
-          <w:lang w:val="en-US"/>
-        </w:rPr>
-      </w:pPr>
-      <w:r>
-        <w:rPr>
-          <w:lang w:val="en-US"/>
-        </w:rPr>
+      </w:pPr>
+      <w:r>
         <w:t>Shovel</w:t>
       </w:r>
     </w:p>
@@ -452,14 +390,8 @@
           <w:ilvl w:val="0"/>
           <w:numId w:val="2"/>
         </w:numPr>
-        <w:rPr>
-          <w:lang w:val="en-US"/>
-        </w:rPr>
-      </w:pPr>
-      <w:r>
-        <w:rPr>
-          <w:lang w:val="en-US"/>
-        </w:rPr>
+      </w:pPr>
+      <w:r>
         <w:t>Rope</w:t>
       </w:r>
     </w:p>
@@ -470,103 +402,42 @@
           <w:ilvl w:val="0"/>
           <w:numId w:val="2"/>
         </w:numPr>
-        <w:rPr>
-          <w:lang w:val="en-US"/>
-        </w:rPr>
-      </w:pPr>
-      <w:r>
-        <w:rPr>
-          <w:lang w:val="en-US"/>
-        </w:rPr>
+      </w:pPr>
+      <w:r>
         <w:t>Crowbar</w:t>
       </w:r>
     </w:p>
-    <w:p>
-      <w:pPr>
-        <w:rPr>
-          <w:lang w:val="en-US"/>
-        </w:rPr>
-      </w:pPr>
-    </w:p>
-    <w:p>
-      <w:pPr>
-        <w:rPr>
-          <w:lang w:val="en-US"/>
-        </w:rPr>
-      </w:pPr>
-      <w:r>
-        <w:rPr>
-          <w:lang w:val="en-US"/>
-        </w:rPr>
+    <w:p/>
+    <w:p>
+      <w:r>
         <w:t>For faster start of flashing some rooms, I copied them from Synty demo scene. Now will try to edit it for my need.</w:t>
       </w:r>
     </w:p>
-    <w:p>
-      <w:pPr>
-        <w:rPr>
-          <w:lang w:val="en-US"/>
-        </w:rPr>
-      </w:pPr>
-    </w:p>
-    <w:p>
-      <w:pPr>
-        <w:rPr>
-          <w:lang w:val="en-US"/>
-        </w:rPr>
-      </w:pPr>
-      <w:r>
-        <w:rPr>
-          <w:lang w:val="en-US"/>
-        </w:rPr>
+    <w:p/>
+    <w:p>
+      <w:r>
         <w:t>I need some targeting system. So a player could hover over items to pick it up or interact.</w:t>
       </w:r>
       <w:r>
-        <w:rPr>
-          <w:lang w:val="en-US"/>
-        </w:rPr>
         <w:t xml:space="preserve"> I decided to try </w:t>
       </w:r>
       <w:r>
         <w:rPr>
           <w:b/>
           <w:bCs/>
-          <w:lang w:val="en-US"/>
         </w:rPr>
-        <w:t>Object Insights Highlighter</w:t>
-      </w:r>
-      <w:r>
-        <w:rPr>
-          <w:b/>
-          <w:bCs/>
-          <w:lang w:val="en-US"/>
-        </w:rPr>
-        <w:t xml:space="preserve"> </w:t>
-      </w:r>
-      <w:r>
-        <w:rPr>
-          <w:lang w:val="en-US"/>
-        </w:rPr>
+        <w:t xml:space="preserve">Object Insights Highlighter </w:t>
+      </w:r>
+      <w:r>
         <w:t>from Unity Assets store which I wanted to try for very long time.</w:t>
       </w:r>
     </w:p>
     <w:p>
-      <w:pPr>
-        <w:rPr>
-          <w:lang w:val="en-US"/>
-        </w:rPr>
-      </w:pPr>
-      <w:r>
-        <w:rPr>
-          <w:lang w:val="en-US"/>
-        </w:rPr>
+      <w:r>
         <w:lastRenderedPageBreak/>
         <w:t>Looks like it doesn’t work just “straight out of the box”, need to find if I missed any scripts.</w:t>
       </w:r>
       <w:r>
-        <w:rPr>
-          <w:noProof/>
-          <w:lang w:val="en-US"/>
-        </w:rPr>
         <w:drawing>
           <wp:inline distT="0" distB="0" distL="0" distR="0" wp14:anchorId="19EB5904" wp14:editId="00D26848">
             <wp:extent cx="5762625" cy="2628900"/>
@@ -618,34 +489,16 @@
       </w:r>
     </w:p>
     <w:p>
-      <w:pPr>
-        <w:rPr>
-          <w:lang w:val="en-US"/>
-        </w:rPr>
-      </w:pPr>
-      <w:r>
-        <w:rPr>
-          <w:lang w:val="en-US"/>
-        </w:rPr>
+      <w:r>
         <w:t>Yes, there was a script with raycast for camera. It still doesn’t work for interactive object detail popup.</w:t>
       </w:r>
       <w:r>
-        <w:rPr>
-          <w:lang w:val="en-US"/>
-        </w:rPr>
         <w:t xml:space="preserve"> I missed to assign a button from drop down menu. Now everything works. And hopefully I have working raycast for other kind of interactions.</w:t>
       </w:r>
       <w:r>
-        <w:rPr>
-          <w:lang w:val="en-US"/>
-        </w:rPr>
         <w:br/>
       </w:r>
       <w:r>
-        <w:rPr>
-          <w:noProof/>
-          <w:lang w:val="en-US"/>
-        </w:rPr>
         <w:drawing>
           <wp:inline distT="0" distB="0" distL="0" distR="0" wp14:anchorId="31068743" wp14:editId="526AF101">
             <wp:extent cx="5743575" cy="2114550"/>
@@ -696,159 +549,74 @@
         </w:drawing>
       </w:r>
     </w:p>
-    <w:p>
-      <w:pPr>
-        <w:rPr>
-          <w:lang w:val="en-US"/>
-        </w:rPr>
-      </w:pPr>
-    </w:p>
-    <w:p>
-      <w:pPr>
-        <w:rPr>
-          <w:lang w:val="en-US"/>
-        </w:rPr>
-      </w:pPr>
-      <w:r>
-        <w:rPr>
-          <w:lang w:val="en-US"/>
-        </w:rPr>
+    <w:p/>
+    <w:p>
+      <w:r>
         <w:t>I need some teleportation system, preferably with choice of swapping destinations.</w:t>
       </w:r>
       <w:r>
-        <w:rPr>
-          <w:lang w:val="en-US"/>
-        </w:rPr>
         <w:t xml:space="preserve"> After long search I found a tutorial </w:t>
       </w:r>
       <w:r>
         <w:rPr>
           <w:b/>
           <w:bCs/>
-          <w:lang w:val="en-US"/>
         </w:rPr>
-        <w:t>Creating a Portal System in Unity</w:t>
-      </w:r>
-      <w:r>
-        <w:rPr>
-          <w:b/>
-          <w:bCs/>
-          <w:lang w:val="en-US"/>
-        </w:rPr>
-        <w:t xml:space="preserve"> </w:t>
-      </w:r>
-      <w:r>
-        <w:rPr>
-          <w:lang w:val="en-US"/>
-        </w:rPr>
+        <w:t xml:space="preserve">Creating a Portal System in Unity </w:t>
+      </w:r>
+      <w:r>
         <w:t>(</w:t>
       </w:r>
       <w:hyperlink r:id="rId13" w:history="1">
         <w:r>
           <w:rPr>
             <w:rStyle w:val="Hyperlink"/>
-            <w:lang w:val="en-US"/>
           </w:rPr>
           <w:t>https://medium.com/@tmaurodot/creating-a-portal-system-in-unity-f25954537c00</w:t>
         </w:r>
       </w:hyperlink>
       <w:r>
-        <w:rPr>
-          <w:lang w:val="en-US"/>
-        </w:rPr>
         <w:t>). It is not ideal as the portal looks like an unmoving image. But will sort it out later if I have time.</w:t>
       </w:r>
     </w:p>
     <w:p>
-      <w:pPr>
-        <w:rPr>
-          <w:lang w:val="en-US"/>
-        </w:rPr>
-      </w:pPr>
-      <w:r>
-        <w:rPr>
-          <w:lang w:val="en-US"/>
-        </w:rPr>
+      <w:r>
         <w:t>Tutorials to look at if I have time:</w:t>
       </w:r>
       <w:r>
-        <w:rPr>
-          <w:lang w:val="en-US"/>
-        </w:rPr>
         <w:br/>
       </w:r>
       <w:hyperlink r:id="rId14" w:history="1">
         <w:r>
           <w:rPr>
             <w:rStyle w:val="Hyperlink"/>
-            <w:lang w:val="en-US"/>
           </w:rPr>
           <w:t>https://www.youtube.com/watch?v=cWpFZbjtSQg</w:t>
         </w:r>
       </w:hyperlink>
     </w:p>
-    <w:p>
-      <w:pPr>
-        <w:rPr>
-          <w:lang w:val="en-US"/>
-        </w:rPr>
-      </w:pPr>
-    </w:p>
-    <w:p>
-      <w:pPr>
-        <w:rPr>
-          <w:lang w:val="en-US"/>
-        </w:rPr>
-      </w:pPr>
-      <w:r>
-        <w:rPr>
-          <w:lang w:val="en-US"/>
-        </w:rPr>
+    <w:p/>
+    <w:p>
+      <w:r>
         <w:t>I need to make rune slots interactable for player to be able to insert the runes.</w:t>
       </w:r>
     </w:p>
     <w:p>
-      <w:pPr>
-        <w:rPr>
-          <w:noProof/>
-        </w:rPr>
-      </w:pPr>
-      <w:r>
-        <w:rPr>
-          <w:lang w:val="en-US"/>
-        </w:rPr>
+      <w:r>
         <w:lastRenderedPageBreak/>
         <w:t>Managed to turn off rune object adding few lines to Object Insights scripts. Now need to mark it in players Inventory</w:t>
       </w:r>
       <w:r>
-        <w:rPr>
-          <w:lang w:val="en-US"/>
-        </w:rPr>
         <w:t xml:space="preserve"> and display in player’s HUD</w:t>
       </w:r>
       <w:r>
-        <w:rPr>
-          <w:lang w:val="en-US"/>
-        </w:rPr>
         <w:t>.</w:t>
       </w:r>
       <w:r>
-        <w:rPr>
-          <w:lang w:val="en-US"/>
-        </w:rPr>
         <w:br/>
-      </w:r>
-      <w:r>
-        <w:rPr>
-          <w:noProof/>
-        </w:rPr>
         <w:t xml:space="preserve"> </w:t>
       </w:r>
       <w:r>
-        <w:rPr>
-          <w:noProof/>
-          <w:lang w:val="en-US"/>
-        </w:rPr>
         <w:drawing>
           <wp:inline distT="0" distB="0" distL="0" distR="0" wp14:anchorId="6EE735D7" wp14:editId="37096155">
             <wp:extent cx="3305636" cy="981212"/>
@@ -887,25 +655,159 @@
       </w:r>
     </w:p>
     <w:p>
-      <w:pPr>
-        <w:rPr>
-          <w:noProof/>
-        </w:rPr>
-      </w:pPr>
-      <w:r>
-        <w:rPr>
-          <w:noProof/>
-        </w:rPr>
+      <w:r>
         <w:t>Runes marks in the Player inventory and appear in the HUD, can be used at the slot if picked. On slotting runes inventory sores a list of rune/teleport activation order. And teleport on interaction creates first item from that list.</w:t>
       </w:r>
     </w:p>
     <w:p>
-      <w:pPr>
-        <w:rPr>
-          <w:lang w:val="en-US"/>
-        </w:rPr>
-      </w:pPr>
-    </w:p>
+      <w:r>
+        <w:t>If there is no teleport location in the list, teleport is created back to starting location and Judgement() script is activated. This script changes starting location slightly and will be used to choose game ending.</w:t>
+      </w:r>
+      <w:r>
+        <w:br/>
+      </w:r>
+      <w:r>
+        <w:drawing>
+          <wp:inline distT="0" distB="0" distL="0" distR="0" wp14:anchorId="5B635040" wp14:editId="7F1F2B80">
+            <wp:extent cx="5762625" cy="4391025"/>
+            <wp:effectExtent l="0" t="0" r="9525" b="9525"/>
+            <wp:docPr id="1850721488" name="Picture 2"/>
+            <wp:cNvGraphicFramePr>
+              <a:graphicFrameLocks xmlns:a="http://schemas.openxmlformats.org/drawingml/2006/main" noChangeAspect="1"/>
+            </wp:cNvGraphicFramePr>
+            <a:graphic xmlns:a="http://schemas.openxmlformats.org/drawingml/2006/main">
+              <a:graphicData uri="http://schemas.openxmlformats.org/drawingml/2006/picture">
+                <pic:pic xmlns:pic="http://schemas.openxmlformats.org/drawingml/2006/picture">
+                  <pic:nvPicPr>
+                    <pic:cNvPr id="0" name="Picture 2"/>
+                    <pic:cNvPicPr>
+                      <a:picLocks noChangeAspect="1" noChangeArrowheads="1"/>
+                    </pic:cNvPicPr>
+                  </pic:nvPicPr>
+                  <pic:blipFill>
+                    <a:blip r:embed="rId16">
+                      <a:extLst>
+                        <a:ext uri="{28A0092B-C50C-407E-A947-70E740481C1C}">
+                          <a14:useLocalDpi xmlns:a14="http://schemas.microsoft.com/office/drawing/2010/main" val="0"/>
+                        </a:ext>
+                      </a:extLst>
+                    </a:blip>
+                    <a:srcRect/>
+                    <a:stretch>
+                      <a:fillRect/>
+                    </a:stretch>
+                  </pic:blipFill>
+                  <pic:spPr bwMode="auto">
+                    <a:xfrm>
+                      <a:off x="0" y="0"/>
+                      <a:ext cx="5762625" cy="4391025"/>
+                    </a:xfrm>
+                    <a:prstGeom prst="rect">
+                      <a:avLst/>
+                    </a:prstGeom>
+                    <a:noFill/>
+                    <a:ln>
+                      <a:noFill/>
+                    </a:ln>
+                  </pic:spPr>
+                </pic:pic>
+              </a:graphicData>
+            </a:graphic>
+          </wp:inline>
+        </w:drawing>
+      </w:r>
+    </w:p>
+    <w:p>
+      <w:r>
+        <w:t xml:space="preserve">After making portal images for all portals to rotate compared to player location and few testing I noticed that only first portal image rotates. Took me some time to wrap my head about that </w:t>
+      </w:r>
+      <w:r>
+        <w:t>“look to player from” point has to change depending which teleport is activated and that corresponding camera have to be assigned this point.</w:t>
+      </w:r>
+      <w:r>
+        <w:drawing>
+          <wp:inline distT="0" distB="0" distL="0" distR="0" wp14:anchorId="31F60FEF" wp14:editId="6675177F">
+            <wp:extent cx="5753735" cy="129540"/>
+            <wp:effectExtent l="0" t="0" r="0" b="3810"/>
+            <wp:docPr id="219824520" name="Picture 3"/>
+            <wp:cNvGraphicFramePr>
+              <a:graphicFrameLocks xmlns:a="http://schemas.openxmlformats.org/drawingml/2006/main" noChangeAspect="1"/>
+            </wp:cNvGraphicFramePr>
+            <a:graphic xmlns:a="http://schemas.openxmlformats.org/drawingml/2006/main">
+              <a:graphicData uri="http://schemas.openxmlformats.org/drawingml/2006/picture">
+                <pic:pic xmlns:pic="http://schemas.openxmlformats.org/drawingml/2006/picture">
+                  <pic:nvPicPr>
+                    <pic:cNvPr id="0" name="Picture 3"/>
+                    <pic:cNvPicPr>
+                      <a:picLocks noChangeAspect="1" noChangeArrowheads="1"/>
+                    </pic:cNvPicPr>
+                  </pic:nvPicPr>
+                  <pic:blipFill>
+                    <a:blip r:embed="rId17">
+                      <a:extLst>
+                        <a:ext uri="{28A0092B-C50C-407E-A947-70E740481C1C}">
+                          <a14:useLocalDpi xmlns:a14="http://schemas.microsoft.com/office/drawing/2010/main" val="0"/>
+                        </a:ext>
+                      </a:extLst>
+                    </a:blip>
+                    <a:srcRect/>
+                    <a:stretch>
+                      <a:fillRect/>
+                    </a:stretch>
+                  </pic:blipFill>
+                  <pic:spPr bwMode="auto">
+                    <a:xfrm>
+                      <a:off x="0" y="0"/>
+                      <a:ext cx="5753735" cy="129540"/>
+                    </a:xfrm>
+                    <a:prstGeom prst="rect">
+                      <a:avLst/>
+                    </a:prstGeom>
+                    <a:noFill/>
+                    <a:ln>
+                      <a:noFill/>
+                    </a:ln>
+                  </pic:spPr>
+                </pic:pic>
+              </a:graphicData>
+            </a:graphic>
+          </wp:inline>
+        </w:drawing>
+      </w:r>
+    </w:p>
+    <w:p>
+      <w:r>
+        <w:t>FMOD</w:t>
+      </w:r>
+    </w:p>
+    <w:p>
+      <w:r>
+        <w:lastRenderedPageBreak/>
+        <w:t>On first tries to implement sounds with FMOD started to get errors of “no platform chosen” and “bank file not found”</w:t>
+      </w:r>
+      <w:r>
+        <w:t>. After</w:t>
+      </w:r>
+      <w:r>
+        <w:t xml:space="preserve"> for a while</w:t>
+      </w:r>
+      <w:r>
+        <w:t xml:space="preserve"> unsuccesfully trying to fix issues decided to completely delete FMOD and integrate it again. Used FMOD Integration Tutorial (</w:t>
+      </w:r>
+      <w:hyperlink r:id="rId18" w:history="1">
+        <w:r>
+          <w:rPr>
+            <w:rStyle w:val="Hyperlink"/>
+          </w:rPr>
+          <w:t>https://www.fmod.com/docs/2.03/unity/integration-tutorial.html</w:t>
+        </w:r>
+      </w:hyperlink>
+      <w:r>
+        <w:t>). After which succesfully added first sounds of portals with no errors.</w:t>
+      </w:r>
+    </w:p>
+    <w:p/>
+    <w:p/>
     <w:p>
       <w:r>
         <w:t>TODO</w:t>
@@ -1654,6 +1556,10 @@
   <w:style w:type="paragraph" w:default="1" w:styleId="Normal">
     <w:name w:val="Normal"/>
     <w:qFormat/>
+    <w:rPr>
+      <w:noProof/>
+      <w:lang w:val="en-GB"/>
+    </w:rPr>
   </w:style>
   <w:style w:type="paragraph" w:styleId="Heading1">
     <w:name w:val="heading 1"/>

</xml_diff>